<commit_message>
Bring Word documents up to date
</commit_message>
<xml_diff>
--- a/manuscript/word/cover.docx
+++ b/manuscript/word/cover.docx
@@ -1,6 +1,6 @@
 
 <file path=word/document.xml><?xml version="1.0" encoding="utf-8"?>
-<w:document xmlns:wpc="http://schemas.microsoft.com/office/word/2010/wordprocessingCanvas" xmlns:cx="http://schemas.microsoft.com/office/drawing/2014/chartex" xmlns:cx1="http://schemas.microsoft.com/office/drawing/2015/9/8/chartex" xmlns:cx2="http://schemas.microsoft.com/office/drawing/2015/10/21/chartex" xmlns:cx3="http://schemas.microsoft.com/office/drawing/2016/5/9/chartex" xmlns:cx4="http://schemas.microsoft.com/office/drawing/2016/5/10/chartex" xmlns:cx5="http://schemas.microsoft.com/office/drawing/2016/5/11/chartex" xmlns:cx6="http://schemas.microsoft.com/office/drawing/2016/5/12/chartex" xmlns:cx7="http://schemas.microsoft.com/office/drawing/2016/5/13/chartex" xmlns:cx8="http://schemas.microsoft.com/office/drawing/2016/5/14/chartex" xmlns:mc="http://schemas.openxmlformats.org/markup-compatibility/2006" xmlns:aink="http://schemas.microsoft.com/office/drawing/2016/ink" xmlns:am3d="http://schemas.microsoft.com/office/drawing/2017/model3d" xmlns:o="urn:schemas-microsoft-com:office:office" xmlns:oel="http://schemas.microsoft.com/office/2019/extlst" xmlns:r="http://schemas.openxmlformats.org/officeDocument/2006/relationships" xmlns:m="http://schemas.openxmlformats.org/officeDocument/2006/math" xmlns:v="urn:schemas-microsoft-com:vml" xmlns:wp14="http://schemas.microsoft.com/office/word/2010/wordprocessingDrawing" xmlns:wp="http://schemas.openxmlformats.org/drawingml/2006/wordprocessingDrawing" xmlns:w10="urn:schemas-microsoft-com:office:word" xmlns:w="http://schemas.openxmlformats.org/wordprocessingml/2006/main" xmlns:w14="http://schemas.microsoft.com/office/word/2010/wordml" xmlns:w15="http://schemas.microsoft.com/office/word/2012/wordml" xmlns:w16cex="http://schemas.microsoft.com/office/word/2018/wordml/cex" xmlns:w16cid="http://schemas.microsoft.com/office/word/2016/wordml/cid" xmlns:w16="http://schemas.microsoft.com/office/word/2018/wordml" xmlns:w16du="http://schemas.microsoft.com/office/word/2023/wordml/word16du" xmlns:w16sdtdh="http://schemas.microsoft.com/office/word/2020/wordml/sdtdatahash" xmlns:w16sdtfl="http://schemas.microsoft.com/office/word/2024/wordml/sdtformatlock" xmlns:w16se="http://schemas.microsoft.com/office/word/2015/wordml/symex" xmlns:wpg="http://schemas.microsoft.com/office/word/2010/wordprocessingGroup" xmlns:wpi="http://schemas.microsoft.com/office/word/2010/wordprocessingInk" xmlns:wne="http://schemas.microsoft.com/office/word/2006/wordml" xmlns:wps="http://schemas.microsoft.com/office/word/2010/wordprocessingShape" mc:Ignorable="w14 w15 w16se w16cid w16 w16cex w16sdtdh w16sdtfl w16du wp14">
+<w:document xmlns:wpc="http://schemas.microsoft.com/office/word/2010/wordprocessingCanvas" xmlns:cx="http://schemas.microsoft.com/office/drawing/2014/chartex" xmlns:cx1="http://schemas.microsoft.com/office/drawing/2015/9/8/chartex" xmlns:cx2="http://schemas.microsoft.com/office/drawing/2015/10/21/chartex" xmlns:cx3="http://schemas.microsoft.com/office/drawing/2016/5/9/chartex" xmlns:cx4="http://schemas.microsoft.com/office/drawing/2016/5/10/chartex" xmlns:cx5="http://schemas.microsoft.com/office/drawing/2016/5/11/chartex" xmlns:cx6="http://schemas.microsoft.com/office/drawing/2016/5/12/chartex" xmlns:cx7="http://schemas.microsoft.com/office/drawing/2016/5/13/chartex" xmlns:cx8="http://schemas.microsoft.com/office/drawing/2016/5/14/chartex" xmlns:mc="http://schemas.openxmlformats.org/markup-compatibility/2006" xmlns:aink="http://schemas.microsoft.com/office/drawing/2016/ink" xmlns:am3d="http://schemas.microsoft.com/office/drawing/2017/model3d" xmlns:o="urn:schemas-microsoft-com:office:office" xmlns:oel="http://schemas.microsoft.com/office/2019/extlst" xmlns:r="http://schemas.openxmlformats.org/officeDocument/2006/relationships" xmlns:m="http://schemas.openxmlformats.org/officeDocument/2006/math" xmlns:v="urn:schemas-microsoft-com:vml" xmlns:wp14="http://schemas.microsoft.com/office/word/2010/wordprocessingDrawing" xmlns:wp="http://schemas.openxmlformats.org/drawingml/2006/wordprocessingDrawing" xmlns:w10="urn:schemas-microsoft-com:office:word" xmlns:w="http://schemas.openxmlformats.org/wordprocessingml/2006/main" xmlns:w14="http://schemas.microsoft.com/office/word/2010/wordml" xmlns:w15="http://schemas.microsoft.com/office/word/2012/wordml" xmlns:w16cei="http://schemas.microsoft.com/office/word/2026/wordml/cei" xmlns:w16cex="http://schemas.microsoft.com/office/word/2018/wordml/cex" xmlns:w16cid="http://schemas.microsoft.com/office/word/2016/wordml/cid" xmlns:w16="http://schemas.microsoft.com/office/word/2018/wordml" xmlns:w16du="http://schemas.microsoft.com/office/word/2023/wordml/word16du" xmlns:w16sdtdh="http://schemas.microsoft.com/office/word/2020/wordml/sdtdatahash" xmlns:w16sdtfl="http://schemas.microsoft.com/office/word/2024/wordml/sdtformatlock" xmlns:w16se="http://schemas.microsoft.com/office/word/2015/wordml/symex" xmlns:wpg="http://schemas.microsoft.com/office/word/2010/wordprocessingGroup" xmlns:wpi="http://schemas.microsoft.com/office/word/2010/wordprocessingInk" xmlns:wne="http://schemas.microsoft.com/office/word/2006/wordml" xmlns:wps="http://schemas.microsoft.com/office/word/2010/wordprocessingShape" mc:Ignorable="w14 w15 w16se w16cid w16 w16cex w16sdtdh w16sdtfl w16du wp14">
   <w:body>
     <w:p>
       <w:pPr>
@@ -48,7 +48,7 @@
           <w:noProof/>
           <w:szCs w:val="24"/>
         </w:rPr>
-        <w:t>May 4, 2026</w:t>
+        <w:t>August 2, 2026</w:t>
       </w:r>
       <w:r>
         <w:rPr>
@@ -129,7 +129,25 @@
         <w:rPr>
           <w:rFonts w:ascii="Times New Roman" w:hAnsi="Times New Roman"/>
         </w:rPr>
-        <w:t>Thank you for the opportunity to revise our</w:t>
+        <w:t xml:space="preserve">Thank you for </w:t>
+      </w:r>
+      <w:r>
+        <w:rPr>
+          <w:rFonts w:ascii="Times New Roman" w:hAnsi="Times New Roman"/>
+        </w:rPr>
+        <w:t>the opportunity to revise</w:t>
+      </w:r>
+      <w:r>
+        <w:rPr>
+          <w:rFonts w:ascii="Times New Roman" w:hAnsi="Times New Roman"/>
+        </w:rPr>
+        <w:t xml:space="preserve"> </w:t>
+      </w:r>
+      <w:r>
+        <w:rPr>
+          <w:rFonts w:ascii="Times New Roman" w:hAnsi="Times New Roman"/>
+        </w:rPr>
+        <w:t>our</w:t>
       </w:r>
       <w:r>
         <w:rPr>
@@ -205,43 +223,19 @@
         <w:rPr>
           <w:rFonts w:ascii="Times New Roman" w:hAnsi="Times New Roman"/>
         </w:rPr>
-        <w:t xml:space="preserve">Please see our detailed responses to both Reviewers. We were excited to see that </w:t>
-      </w:r>
-      <w:r>
-        <w:rPr>
-          <w:rFonts w:ascii="Times New Roman" w:hAnsi="Times New Roman"/>
-        </w:rPr>
-        <w:t xml:space="preserve">the </w:t>
-      </w:r>
-      <w:r>
-        <w:rPr>
-          <w:rFonts w:ascii="Times New Roman" w:hAnsi="Times New Roman"/>
-        </w:rPr>
-        <w:t xml:space="preserve">Reviewers were complimentary of our original submission, noting the contribution to the field as well as the quality of our writing in </w:t>
-      </w:r>
-      <w:r>
-        <w:rPr>
-          <w:rFonts w:ascii="Times New Roman" w:hAnsi="Times New Roman"/>
-        </w:rPr>
-        <w:t>the</w:t>
-      </w:r>
-      <w:r>
-        <w:rPr>
-          <w:rFonts w:ascii="Times New Roman" w:hAnsi="Times New Roman"/>
-        </w:rPr>
-        <w:t xml:space="preserve"> concise and targeted format</w:t>
-      </w:r>
-      <w:r>
-        <w:rPr>
-          <w:rFonts w:ascii="Times New Roman" w:hAnsi="Times New Roman"/>
-        </w:rPr>
-        <w:t xml:space="preserve"> of a Brief Communication</w:t>
-      </w:r>
-      <w:r>
-        <w:rPr>
-          <w:rFonts w:ascii="Times New Roman" w:hAnsi="Times New Roman"/>
-        </w:rPr>
-        <w:t>. We found all feedback constructive and hope you will find our revised manuscript of improved quality.</w:t>
+        <w:t xml:space="preserve">Per </w:t>
+      </w:r>
+      <w:r>
+        <w:rPr>
+          <w:rFonts w:ascii="Times New Roman" w:hAnsi="Times New Roman"/>
+        </w:rPr>
+        <w:t>request, we have made</w:t>
+      </w:r>
+      <w:r>
+        <w:rPr>
+          <w:rFonts w:ascii="Times New Roman" w:hAnsi="Times New Roman"/>
+        </w:rPr>
+        <w:t xml:space="preserve"> some minor edits in preparation for the proofing stage (see Reviewer Response file).</w:t>
       </w:r>
     </w:p>
     <w:p>
@@ -263,29 +257,21 @@
           <w:rFonts w:ascii="Times New Roman" w:hAnsi="Times New Roman"/>
         </w:rPr>
       </w:pPr>
-      <w:r>
-        <w:rPr>
-          <w:rFonts w:ascii="Times New Roman" w:hAnsi="Times New Roman"/>
-        </w:rPr>
-        <w:t xml:space="preserve">Thank you </w:t>
-      </w:r>
-      <w:r>
-        <w:rPr>
-          <w:rFonts w:ascii="Times New Roman" w:hAnsi="Times New Roman"/>
-        </w:rPr>
-        <w:t xml:space="preserve">again </w:t>
-      </w:r>
-      <w:r>
-        <w:rPr>
-          <w:rFonts w:ascii="Times New Roman" w:hAnsi="Times New Roman"/>
-        </w:rPr>
-        <w:t xml:space="preserve">for your time and </w:t>
-      </w:r>
-      <w:r>
-        <w:rPr>
-          <w:rFonts w:ascii="Times New Roman" w:hAnsi="Times New Roman"/>
-        </w:rPr>
-        <w:t>efforts in helping us disseminate this work.</w:t>
+    </w:p>
+    <w:p>
+      <w:pPr>
+        <w:autoSpaceDE w:val="0"/>
+        <w:autoSpaceDN w:val="0"/>
+        <w:adjustRightInd w:val="0"/>
+        <w:rPr>
+          <w:rFonts w:ascii="Times New Roman" w:hAnsi="Times New Roman"/>
+        </w:rPr>
+      </w:pPr>
+      <w:r>
+        <w:rPr>
+          <w:rFonts w:ascii="Times New Roman" w:hAnsi="Times New Roman"/>
+        </w:rPr>
+        <w:t>Thanks again for helping us get this work disseminated.</w:t>
       </w:r>
     </w:p>
     <w:p>
@@ -359,7 +345,7 @@
                     </pic:cNvPicPr>
                   </pic:nvPicPr>
                   <pic:blipFill>
-                    <a:blip r:embed="rId6"/>
+                    <a:blip r:embed="rId7"/>
                     <a:stretch>
                       <a:fillRect/>
                     </a:stretch>
@@ -407,7 +393,7 @@
                 <wp:cNvGraphicFramePr/>
                 <a:graphic xmlns:a="http://schemas.openxmlformats.org/drawingml/2006/main">
                   <a:graphicData uri="http://schemas.microsoft.com/office/word/2010/wordprocessingInk">
-                    <w14:contentPart bwMode="auto" r:id="rId7">
+                    <w14:contentPart bwMode="auto" r:id="rId8">
                       <w14:nvContentPartPr>
                         <w14:cNvContentPartPr/>
                       </w14:nvContentPartPr>
@@ -443,7 +429,7 @@
                 <o:lock v:ext="edit" aspectratio="t"/>
               </v:shapetype>
               <v:shape id="Ink 5" o:spid="_x0000_s1026" type="#_x0000_t75" style="position:absolute;margin-left:-18.35pt;margin-top:-.45pt;width:.75pt;height:.75pt;z-index:251660288;visibility:visible;mso-wrap-style:square;mso-wrap-distance-left:9pt;mso-wrap-distance-top:0;mso-wrap-distance-right:9pt;mso-wrap-distance-bottom:0;mso-position-horizontal:absolute;mso-position-horizontal-relative:text;mso-position-vertical:absolute;mso-position-vertical-relative:text" o:gfxdata="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">
-                <v:imagedata r:id="rId8" o:title=""/>
+                <v:imagedata r:id="rId9" o:title=""/>
               </v:shape>
             </w:pict>
           </mc:Fallback>
@@ -473,7 +459,7 @@
                 <wp:cNvGraphicFramePr/>
                 <a:graphic xmlns:a="http://schemas.openxmlformats.org/drawingml/2006/main">
                   <a:graphicData uri="http://schemas.microsoft.com/office/word/2010/wordprocessingInk">
-                    <w14:contentPart bwMode="auto" r:id="rId9">
+                    <w14:contentPart bwMode="auto" r:id="rId10">
                       <w14:nvContentPartPr>
                         <w14:cNvContentPartPr/>
                       </w14:nvContentPartPr>
@@ -490,7 +476,7 @@
           <mc:Fallback>
             <w:pict>
               <v:shape w14:anchorId="6D0D8E99" id="Ink 3" o:spid="_x0000_s1026" type="#_x0000_t75" style="position:absolute;margin-left:235.1pt;margin-top:28.75pt;width:.75pt;height:.75pt;z-index:251659264;visibility:visible;mso-wrap-style:square;mso-wrap-distance-left:9pt;mso-wrap-distance-top:0;mso-wrap-distance-right:9pt;mso-wrap-distance-bottom:0;mso-position-horizontal:absolute;mso-position-horizontal-relative:text;mso-position-vertical:absolute;mso-position-vertical-relative:text" o:gfxdata="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">
-                <v:imagedata r:id="rId8" o:title=""/>
+                <v:imagedata r:id="rId9" o:title=""/>
               </v:shape>
             </w:pict>
           </mc:Fallback>
@@ -534,8 +520,8 @@
       </w:r>
     </w:p>
     <w:sectPr>
-      <w:headerReference w:type="default" r:id="rId10"/>
-      <w:headerReference w:type="first" r:id="rId11"/>
+      <w:headerReference w:type="default" r:id="rId11"/>
+      <w:headerReference w:type="first" r:id="rId12"/>
       <w:pgSz w:w="12240" w:h="15840"/>
       <w:pgMar w:top="1440" w:right="1440" w:bottom="1440" w:left="1440" w:header="720" w:footer="720" w:gutter="0"/>
       <w:cols w:space="720"/>
@@ -546,7 +532,7 @@
 </file>
 
 <file path=word/endnotes.xml><?xml version="1.0" encoding="utf-8"?>
-<w:endnotes xmlns:wpc="http://schemas.microsoft.com/office/word/2010/wordprocessingCanvas" xmlns:cx="http://schemas.microsoft.com/office/drawing/2014/chartex" xmlns:cx1="http://schemas.microsoft.com/office/drawing/2015/9/8/chartex" xmlns:cx2="http://schemas.microsoft.com/office/drawing/2015/10/21/chartex" xmlns:cx3="http://schemas.microsoft.com/office/drawing/2016/5/9/chartex" xmlns:cx4="http://schemas.microsoft.com/office/drawing/2016/5/10/chartex" xmlns:cx5="http://schemas.microsoft.com/office/drawing/2016/5/11/chartex" xmlns:cx6="http://schemas.microsoft.com/office/drawing/2016/5/12/chartex" xmlns:cx7="http://schemas.microsoft.com/office/drawing/2016/5/13/chartex" xmlns:cx8="http://schemas.microsoft.com/office/drawing/2016/5/14/chartex" xmlns:mc="http://schemas.openxmlformats.org/markup-compatibility/2006" xmlns:aink="http://schemas.microsoft.com/office/drawing/2016/ink" xmlns:am3d="http://schemas.microsoft.com/office/drawing/2017/model3d" xmlns:o="urn:schemas-microsoft-com:office:office" xmlns:oel="http://schemas.microsoft.com/office/2019/extlst" xmlns:r="http://schemas.openxmlformats.org/officeDocument/2006/relationships" xmlns:m="http://schemas.openxmlformats.org/officeDocument/2006/math" xmlns:v="urn:schemas-microsoft-com:vml" xmlns:wp14="http://schemas.microsoft.com/office/word/2010/wordprocessingDrawing" xmlns:wp="http://schemas.openxmlformats.org/drawingml/2006/wordprocessingDrawing" xmlns:w10="urn:schemas-microsoft-com:office:word" xmlns:w="http://schemas.openxmlformats.org/wordprocessingml/2006/main" xmlns:w14="http://schemas.microsoft.com/office/word/2010/wordml" xmlns:w15="http://schemas.microsoft.com/office/word/2012/wordml" xmlns:w16cex="http://schemas.microsoft.com/office/word/2018/wordml/cex" xmlns:w16cid="http://schemas.microsoft.com/office/word/2016/wordml/cid" xmlns:w16="http://schemas.microsoft.com/office/word/2018/wordml" xmlns:w16du="http://schemas.microsoft.com/office/word/2023/wordml/word16du" xmlns:w16sdtdh="http://schemas.microsoft.com/office/word/2020/wordml/sdtdatahash" xmlns:w16sdtfl="http://schemas.microsoft.com/office/word/2024/wordml/sdtformatlock" xmlns:w16se="http://schemas.microsoft.com/office/word/2015/wordml/symex" xmlns:wpg="http://schemas.microsoft.com/office/word/2010/wordprocessingGroup" xmlns:wpi="http://schemas.microsoft.com/office/word/2010/wordprocessingInk" xmlns:wne="http://schemas.microsoft.com/office/word/2006/wordml" xmlns:wps="http://schemas.microsoft.com/office/word/2010/wordprocessingShape" mc:Ignorable="w14 w15 w16se w16cid w16 w16cex w16sdtdh w16sdtfl w16du wp14">
+<w:endnotes xmlns:wpc="http://schemas.microsoft.com/office/word/2010/wordprocessingCanvas" xmlns:cx="http://schemas.microsoft.com/office/drawing/2014/chartex" xmlns:cx1="http://schemas.microsoft.com/office/drawing/2015/9/8/chartex" xmlns:cx2="http://schemas.microsoft.com/office/drawing/2015/10/21/chartex" xmlns:cx3="http://schemas.microsoft.com/office/drawing/2016/5/9/chartex" xmlns:cx4="http://schemas.microsoft.com/office/drawing/2016/5/10/chartex" xmlns:cx5="http://schemas.microsoft.com/office/drawing/2016/5/11/chartex" xmlns:cx6="http://schemas.microsoft.com/office/drawing/2016/5/12/chartex" xmlns:cx7="http://schemas.microsoft.com/office/drawing/2016/5/13/chartex" xmlns:cx8="http://schemas.microsoft.com/office/drawing/2016/5/14/chartex" xmlns:mc="http://schemas.openxmlformats.org/markup-compatibility/2006" xmlns:aink="http://schemas.microsoft.com/office/drawing/2016/ink" xmlns:am3d="http://schemas.microsoft.com/office/drawing/2017/model3d" xmlns:o="urn:schemas-microsoft-com:office:office" xmlns:oel="http://schemas.microsoft.com/office/2019/extlst" xmlns:r="http://schemas.openxmlformats.org/officeDocument/2006/relationships" xmlns:m="http://schemas.openxmlformats.org/officeDocument/2006/math" xmlns:v="urn:schemas-microsoft-com:vml" xmlns:wp14="http://schemas.microsoft.com/office/word/2010/wordprocessingDrawing" xmlns:wp="http://schemas.openxmlformats.org/drawingml/2006/wordprocessingDrawing" xmlns:w10="urn:schemas-microsoft-com:office:word" xmlns:w="http://schemas.openxmlformats.org/wordprocessingml/2006/main" xmlns:w14="http://schemas.microsoft.com/office/word/2010/wordml" xmlns:w15="http://schemas.microsoft.com/office/word/2012/wordml" xmlns:w16cei="http://schemas.microsoft.com/office/word/2026/wordml/cei" xmlns:w16cex="http://schemas.microsoft.com/office/word/2018/wordml/cex" xmlns:w16cid="http://schemas.microsoft.com/office/word/2016/wordml/cid" xmlns:w16="http://schemas.microsoft.com/office/word/2018/wordml" xmlns:w16du="http://schemas.microsoft.com/office/word/2023/wordml/word16du" xmlns:w16sdtdh="http://schemas.microsoft.com/office/word/2020/wordml/sdtdatahash" xmlns:w16sdtfl="http://schemas.microsoft.com/office/word/2024/wordml/sdtformatlock" xmlns:w16se="http://schemas.microsoft.com/office/word/2015/wordml/symex" xmlns:wpg="http://schemas.microsoft.com/office/word/2010/wordprocessingGroup" xmlns:wpi="http://schemas.microsoft.com/office/word/2010/wordprocessingInk" xmlns:wne="http://schemas.microsoft.com/office/word/2006/wordml" xmlns:wps="http://schemas.microsoft.com/office/word/2010/wordprocessingShape" mc:Ignorable="w14 w15 w16se w16cid w16 w16cex w16sdtdh w16sdtfl w16du wp14">
   <w:endnote w:type="separator" w:id="-1">
     <w:p>
       <w:r>
@@ -565,7 +551,7 @@
 </file>
 
 <file path=word/footnotes.xml><?xml version="1.0" encoding="utf-8"?>
-<w:footnotes xmlns:wpc="http://schemas.microsoft.com/office/word/2010/wordprocessingCanvas" xmlns:cx="http://schemas.microsoft.com/office/drawing/2014/chartex" xmlns:cx1="http://schemas.microsoft.com/office/drawing/2015/9/8/chartex" xmlns:cx2="http://schemas.microsoft.com/office/drawing/2015/10/21/chartex" xmlns:cx3="http://schemas.microsoft.com/office/drawing/2016/5/9/chartex" xmlns:cx4="http://schemas.microsoft.com/office/drawing/2016/5/10/chartex" xmlns:cx5="http://schemas.microsoft.com/office/drawing/2016/5/11/chartex" xmlns:cx6="http://schemas.microsoft.com/office/drawing/2016/5/12/chartex" xmlns:cx7="http://schemas.microsoft.com/office/drawing/2016/5/13/chartex" xmlns:cx8="http://schemas.microsoft.com/office/drawing/2016/5/14/chartex" xmlns:mc="http://schemas.openxmlformats.org/markup-compatibility/2006" xmlns:aink="http://schemas.microsoft.com/office/drawing/2016/ink" xmlns:am3d="http://schemas.microsoft.com/office/drawing/2017/model3d" xmlns:o="urn:schemas-microsoft-com:office:office" xmlns:oel="http://schemas.microsoft.com/office/2019/extlst" xmlns:r="http://schemas.openxmlformats.org/officeDocument/2006/relationships" xmlns:m="http://schemas.openxmlformats.org/officeDocument/2006/math" xmlns:v="urn:schemas-microsoft-com:vml" xmlns:wp14="http://schemas.microsoft.com/office/word/2010/wordprocessingDrawing" xmlns:wp="http://schemas.openxmlformats.org/drawingml/2006/wordprocessingDrawing" xmlns:w10="urn:schemas-microsoft-com:office:word" xmlns:w="http://schemas.openxmlformats.org/wordprocessingml/2006/main" xmlns:w14="http://schemas.microsoft.com/office/word/2010/wordml" xmlns:w15="http://schemas.microsoft.com/office/word/2012/wordml" xmlns:w16cex="http://schemas.microsoft.com/office/word/2018/wordml/cex" xmlns:w16cid="http://schemas.microsoft.com/office/word/2016/wordml/cid" xmlns:w16="http://schemas.microsoft.com/office/word/2018/wordml" xmlns:w16du="http://schemas.microsoft.com/office/word/2023/wordml/word16du" xmlns:w16sdtdh="http://schemas.microsoft.com/office/word/2020/wordml/sdtdatahash" xmlns:w16sdtfl="http://schemas.microsoft.com/office/word/2024/wordml/sdtformatlock" xmlns:w16se="http://schemas.microsoft.com/office/word/2015/wordml/symex" xmlns:wpg="http://schemas.microsoft.com/office/word/2010/wordprocessingGroup" xmlns:wpi="http://schemas.microsoft.com/office/word/2010/wordprocessingInk" xmlns:wne="http://schemas.microsoft.com/office/word/2006/wordml" xmlns:wps="http://schemas.microsoft.com/office/word/2010/wordprocessingShape" mc:Ignorable="w14 w15 w16se w16cid w16 w16cex w16sdtdh w16sdtfl w16du wp14">
+<w:footnotes xmlns:wpc="http://schemas.microsoft.com/office/word/2010/wordprocessingCanvas" xmlns:cx="http://schemas.microsoft.com/office/drawing/2014/chartex" xmlns:cx1="http://schemas.microsoft.com/office/drawing/2015/9/8/chartex" xmlns:cx2="http://schemas.microsoft.com/office/drawing/2015/10/21/chartex" xmlns:cx3="http://schemas.microsoft.com/office/drawing/2016/5/9/chartex" xmlns:cx4="http://schemas.microsoft.com/office/drawing/2016/5/10/chartex" xmlns:cx5="http://schemas.microsoft.com/office/drawing/2016/5/11/chartex" xmlns:cx6="http://schemas.microsoft.com/office/drawing/2016/5/12/chartex" xmlns:cx7="http://schemas.microsoft.com/office/drawing/2016/5/13/chartex" xmlns:cx8="http://schemas.microsoft.com/office/drawing/2016/5/14/chartex" xmlns:mc="http://schemas.openxmlformats.org/markup-compatibility/2006" xmlns:aink="http://schemas.microsoft.com/office/drawing/2016/ink" xmlns:am3d="http://schemas.microsoft.com/office/drawing/2017/model3d" xmlns:o="urn:schemas-microsoft-com:office:office" xmlns:oel="http://schemas.microsoft.com/office/2019/extlst" xmlns:r="http://schemas.openxmlformats.org/officeDocument/2006/relationships" xmlns:m="http://schemas.openxmlformats.org/officeDocument/2006/math" xmlns:v="urn:schemas-microsoft-com:vml" xmlns:wp14="http://schemas.microsoft.com/office/word/2010/wordprocessingDrawing" xmlns:wp="http://schemas.openxmlformats.org/drawingml/2006/wordprocessingDrawing" xmlns:w10="urn:schemas-microsoft-com:office:word" xmlns:w="http://schemas.openxmlformats.org/wordprocessingml/2006/main" xmlns:w14="http://schemas.microsoft.com/office/word/2010/wordml" xmlns:w15="http://schemas.microsoft.com/office/word/2012/wordml" xmlns:w16cei="http://schemas.microsoft.com/office/word/2026/wordml/cei" xmlns:w16cex="http://schemas.microsoft.com/office/word/2018/wordml/cex" xmlns:w16cid="http://schemas.microsoft.com/office/word/2016/wordml/cid" xmlns:w16="http://schemas.microsoft.com/office/word/2018/wordml" xmlns:w16du="http://schemas.microsoft.com/office/word/2023/wordml/word16du" xmlns:w16sdtdh="http://schemas.microsoft.com/office/word/2020/wordml/sdtdatahash" xmlns:w16sdtfl="http://schemas.microsoft.com/office/word/2024/wordml/sdtformatlock" xmlns:w16se="http://schemas.microsoft.com/office/word/2015/wordml/symex" xmlns:wpg="http://schemas.microsoft.com/office/word/2010/wordprocessingGroup" xmlns:wpi="http://schemas.microsoft.com/office/word/2010/wordprocessingInk" xmlns:wne="http://schemas.microsoft.com/office/word/2006/wordml" xmlns:wps="http://schemas.microsoft.com/office/word/2010/wordprocessingShape" mc:Ignorable="w14 w15 w16se w16cid w16 w16cex w16sdtdh w16sdtfl w16du wp14">
   <w:footnote w:type="separator" w:id="-1">
     <w:p>
       <w:r>
@@ -584,7 +570,7 @@
 </file>
 
 <file path=word/header1.xml><?xml version="1.0" encoding="utf-8"?>
-<w:hdr xmlns:wpc="http://schemas.microsoft.com/office/word/2010/wordprocessingCanvas" xmlns:cx="http://schemas.microsoft.com/office/drawing/2014/chartex" xmlns:cx1="http://schemas.microsoft.com/office/drawing/2015/9/8/chartex" xmlns:cx2="http://schemas.microsoft.com/office/drawing/2015/10/21/chartex" xmlns:cx3="http://schemas.microsoft.com/office/drawing/2016/5/9/chartex" xmlns:cx4="http://schemas.microsoft.com/office/drawing/2016/5/10/chartex" xmlns:cx5="http://schemas.microsoft.com/office/drawing/2016/5/11/chartex" xmlns:cx6="http://schemas.microsoft.com/office/drawing/2016/5/12/chartex" xmlns:cx7="http://schemas.microsoft.com/office/drawing/2016/5/13/chartex" xmlns:cx8="http://schemas.microsoft.com/office/drawing/2016/5/14/chartex" xmlns:mc="http://schemas.openxmlformats.org/markup-compatibility/2006" xmlns:aink="http://schemas.microsoft.com/office/drawing/2016/ink" xmlns:am3d="http://schemas.microsoft.com/office/drawing/2017/model3d" xmlns:o="urn:schemas-microsoft-com:office:office" xmlns:oel="http://schemas.microsoft.com/office/2019/extlst" xmlns:r="http://schemas.openxmlformats.org/officeDocument/2006/relationships" xmlns:m="http://schemas.openxmlformats.org/officeDocument/2006/math" xmlns:v="urn:schemas-microsoft-com:vml" xmlns:wp14="http://schemas.microsoft.com/office/word/2010/wordprocessingDrawing" xmlns:wp="http://schemas.openxmlformats.org/drawingml/2006/wordprocessingDrawing" xmlns:w10="urn:schemas-microsoft-com:office:word" xmlns:w="http://schemas.openxmlformats.org/wordprocessingml/2006/main" xmlns:w14="http://schemas.microsoft.com/office/word/2010/wordml" xmlns:w15="http://schemas.microsoft.com/office/word/2012/wordml" xmlns:w16cex="http://schemas.microsoft.com/office/word/2018/wordml/cex" xmlns:w16cid="http://schemas.microsoft.com/office/word/2016/wordml/cid" xmlns:w16="http://schemas.microsoft.com/office/word/2018/wordml" xmlns:w16du="http://schemas.microsoft.com/office/word/2023/wordml/word16du" xmlns:w16sdtdh="http://schemas.microsoft.com/office/word/2020/wordml/sdtdatahash" xmlns:w16sdtfl="http://schemas.microsoft.com/office/word/2024/wordml/sdtformatlock" xmlns:w16se="http://schemas.microsoft.com/office/word/2015/wordml/symex" xmlns:wpg="http://schemas.microsoft.com/office/word/2010/wordprocessingGroup" xmlns:wpi="http://schemas.microsoft.com/office/word/2010/wordprocessingInk" xmlns:wne="http://schemas.microsoft.com/office/word/2006/wordml" xmlns:wps="http://schemas.microsoft.com/office/word/2010/wordprocessingShape" mc:Ignorable="w14 w15 w16se w16cid w16 w16cex w16sdtdh w16sdtfl w16du wp14">
+<w:hdr xmlns:wpc="http://schemas.microsoft.com/office/word/2010/wordprocessingCanvas" xmlns:cx="http://schemas.microsoft.com/office/drawing/2014/chartex" xmlns:cx1="http://schemas.microsoft.com/office/drawing/2015/9/8/chartex" xmlns:cx2="http://schemas.microsoft.com/office/drawing/2015/10/21/chartex" xmlns:cx3="http://schemas.microsoft.com/office/drawing/2016/5/9/chartex" xmlns:cx4="http://schemas.microsoft.com/office/drawing/2016/5/10/chartex" xmlns:cx5="http://schemas.microsoft.com/office/drawing/2016/5/11/chartex" xmlns:cx6="http://schemas.microsoft.com/office/drawing/2016/5/12/chartex" xmlns:cx7="http://schemas.microsoft.com/office/drawing/2016/5/13/chartex" xmlns:cx8="http://schemas.microsoft.com/office/drawing/2016/5/14/chartex" xmlns:mc="http://schemas.openxmlformats.org/markup-compatibility/2006" xmlns:aink="http://schemas.microsoft.com/office/drawing/2016/ink" xmlns:am3d="http://schemas.microsoft.com/office/drawing/2017/model3d" xmlns:o="urn:schemas-microsoft-com:office:office" xmlns:oel="http://schemas.microsoft.com/office/2019/extlst" xmlns:r="http://schemas.openxmlformats.org/officeDocument/2006/relationships" xmlns:m="http://schemas.openxmlformats.org/officeDocument/2006/math" xmlns:v="urn:schemas-microsoft-com:vml" xmlns:wp14="http://schemas.microsoft.com/office/word/2010/wordprocessingDrawing" xmlns:wp="http://schemas.openxmlformats.org/drawingml/2006/wordprocessingDrawing" xmlns:w10="urn:schemas-microsoft-com:office:word" xmlns:w="http://schemas.openxmlformats.org/wordprocessingml/2006/main" xmlns:w14="http://schemas.microsoft.com/office/word/2010/wordml" xmlns:w15="http://schemas.microsoft.com/office/word/2012/wordml" xmlns:w16cei="http://schemas.microsoft.com/office/word/2026/wordml/cei" xmlns:w16cex="http://schemas.microsoft.com/office/word/2018/wordml/cex" xmlns:w16cid="http://schemas.microsoft.com/office/word/2016/wordml/cid" xmlns:w16="http://schemas.microsoft.com/office/word/2018/wordml" xmlns:w16du="http://schemas.microsoft.com/office/word/2023/wordml/word16du" xmlns:w16sdtdh="http://schemas.microsoft.com/office/word/2020/wordml/sdtdatahash" xmlns:w16sdtfl="http://schemas.microsoft.com/office/word/2024/wordml/sdtformatlock" xmlns:w16se="http://schemas.microsoft.com/office/word/2015/wordml/symex" xmlns:wpg="http://schemas.microsoft.com/office/word/2010/wordprocessingGroup" xmlns:wpi="http://schemas.microsoft.com/office/word/2010/wordprocessingInk" xmlns:wne="http://schemas.microsoft.com/office/word/2006/wordml" xmlns:wps="http://schemas.microsoft.com/office/word/2010/wordprocessingShape" mc:Ignorable="w14 w15 w16se w16cid w16 w16cex w16sdtdh w16sdtfl w16du wp14">
   <w:p>
     <w:pPr>
       <w:pStyle w:val="Header"/>
@@ -625,7 +611,7 @@
         <w:noProof/>
         <w:sz w:val="20"/>
       </w:rPr>
-      <w:t>May 4, 2026</w:t>
+      <w:t>August 2, 2026</w:t>
     </w:r>
     <w:r>
       <w:rPr>
@@ -714,7 +700,7 @@
 </file>
 
 <file path=word/header2.xml><?xml version="1.0" encoding="utf-8"?>
-<w:hdr xmlns:wpc="http://schemas.microsoft.com/office/word/2010/wordprocessingCanvas" xmlns:cx="http://schemas.microsoft.com/office/drawing/2014/chartex" xmlns:cx1="http://schemas.microsoft.com/office/drawing/2015/9/8/chartex" xmlns:cx2="http://schemas.microsoft.com/office/drawing/2015/10/21/chartex" xmlns:cx3="http://schemas.microsoft.com/office/drawing/2016/5/9/chartex" xmlns:cx4="http://schemas.microsoft.com/office/drawing/2016/5/10/chartex" xmlns:cx5="http://schemas.microsoft.com/office/drawing/2016/5/11/chartex" xmlns:cx6="http://schemas.microsoft.com/office/drawing/2016/5/12/chartex" xmlns:cx7="http://schemas.microsoft.com/office/drawing/2016/5/13/chartex" xmlns:cx8="http://schemas.microsoft.com/office/drawing/2016/5/14/chartex" xmlns:mc="http://schemas.openxmlformats.org/markup-compatibility/2006" xmlns:aink="http://schemas.microsoft.com/office/drawing/2016/ink" xmlns:am3d="http://schemas.microsoft.com/office/drawing/2017/model3d" xmlns:o="urn:schemas-microsoft-com:office:office" xmlns:oel="http://schemas.microsoft.com/office/2019/extlst" xmlns:r="http://schemas.openxmlformats.org/officeDocument/2006/relationships" xmlns:m="http://schemas.openxmlformats.org/officeDocument/2006/math" xmlns:v="urn:schemas-microsoft-com:vml" xmlns:wp14="http://schemas.microsoft.com/office/word/2010/wordprocessingDrawing" xmlns:wp="http://schemas.openxmlformats.org/drawingml/2006/wordprocessingDrawing" xmlns:w10="urn:schemas-microsoft-com:office:word" xmlns:w="http://schemas.openxmlformats.org/wordprocessingml/2006/main" xmlns:w14="http://schemas.microsoft.com/office/word/2010/wordml" xmlns:w15="http://schemas.microsoft.com/office/word/2012/wordml" xmlns:w16cex="http://schemas.microsoft.com/office/word/2018/wordml/cex" xmlns:w16cid="http://schemas.microsoft.com/office/word/2016/wordml/cid" xmlns:w16="http://schemas.microsoft.com/office/word/2018/wordml" xmlns:w16du="http://schemas.microsoft.com/office/word/2023/wordml/word16du" xmlns:w16sdtdh="http://schemas.microsoft.com/office/word/2020/wordml/sdtdatahash" xmlns:w16sdtfl="http://schemas.microsoft.com/office/word/2024/wordml/sdtformatlock" xmlns:w16se="http://schemas.microsoft.com/office/word/2015/wordml/symex" xmlns:wpg="http://schemas.microsoft.com/office/word/2010/wordprocessingGroup" xmlns:wpi="http://schemas.microsoft.com/office/word/2010/wordprocessingInk" xmlns:wne="http://schemas.microsoft.com/office/word/2006/wordml" xmlns:wps="http://schemas.microsoft.com/office/word/2010/wordprocessingShape" mc:Ignorable="w14 w15 w16se w16cid w16 w16cex w16sdtdh w16sdtfl w16du wp14">
+<w:hdr xmlns:wpc="http://schemas.microsoft.com/office/word/2010/wordprocessingCanvas" xmlns:cx="http://schemas.microsoft.com/office/drawing/2014/chartex" xmlns:cx1="http://schemas.microsoft.com/office/drawing/2015/9/8/chartex" xmlns:cx2="http://schemas.microsoft.com/office/drawing/2015/10/21/chartex" xmlns:cx3="http://schemas.microsoft.com/office/drawing/2016/5/9/chartex" xmlns:cx4="http://schemas.microsoft.com/office/drawing/2016/5/10/chartex" xmlns:cx5="http://schemas.microsoft.com/office/drawing/2016/5/11/chartex" xmlns:cx6="http://schemas.microsoft.com/office/drawing/2016/5/12/chartex" xmlns:cx7="http://schemas.microsoft.com/office/drawing/2016/5/13/chartex" xmlns:cx8="http://schemas.microsoft.com/office/drawing/2016/5/14/chartex" xmlns:mc="http://schemas.openxmlformats.org/markup-compatibility/2006" xmlns:aink="http://schemas.microsoft.com/office/drawing/2016/ink" xmlns:am3d="http://schemas.microsoft.com/office/drawing/2017/model3d" xmlns:o="urn:schemas-microsoft-com:office:office" xmlns:oel="http://schemas.microsoft.com/office/2019/extlst" xmlns:r="http://schemas.openxmlformats.org/officeDocument/2006/relationships" xmlns:m="http://schemas.openxmlformats.org/officeDocument/2006/math" xmlns:v="urn:schemas-microsoft-com:vml" xmlns:wp14="http://schemas.microsoft.com/office/word/2010/wordprocessingDrawing" xmlns:wp="http://schemas.openxmlformats.org/drawingml/2006/wordprocessingDrawing" xmlns:w10="urn:schemas-microsoft-com:office:word" xmlns:w="http://schemas.openxmlformats.org/wordprocessingml/2006/main" xmlns:w14="http://schemas.microsoft.com/office/word/2010/wordml" xmlns:w15="http://schemas.microsoft.com/office/word/2012/wordml" xmlns:w16cei="http://schemas.microsoft.com/office/word/2026/wordml/cei" xmlns:w16cex="http://schemas.microsoft.com/office/word/2018/wordml/cex" xmlns:w16cid="http://schemas.microsoft.com/office/word/2016/wordml/cid" xmlns:w16="http://schemas.microsoft.com/office/word/2018/wordml" xmlns:w16du="http://schemas.microsoft.com/office/word/2023/wordml/word16du" xmlns:w16sdtdh="http://schemas.microsoft.com/office/word/2020/wordml/sdtdatahash" xmlns:w16sdtfl="http://schemas.microsoft.com/office/word/2024/wordml/sdtformatlock" xmlns:w16se="http://schemas.microsoft.com/office/word/2015/wordml/symex" xmlns:wpg="http://schemas.microsoft.com/office/word/2010/wordprocessingGroup" xmlns:wpi="http://schemas.microsoft.com/office/word/2010/wordprocessingInk" xmlns:wne="http://schemas.microsoft.com/office/word/2006/wordml" xmlns:wps="http://schemas.microsoft.com/office/word/2010/wordprocessingShape" mc:Ignorable="w14 w15 w16se w16cid w16 w16cex w16sdtdh w16sdtfl w16du wp14">
   <w:tbl>
     <w:tblPr>
       <w:tblW w:w="10527" w:type="dxa"/>
@@ -998,6 +984,126 @@
     </w:pPr>
   </w:p>
 </w:hdr>
+</file>
+
+<file path=word/numbering.xml><?xml version="1.0" encoding="utf-8"?>
+<w:numbering xmlns:wpc="http://schemas.microsoft.com/office/word/2010/wordprocessingCanvas" xmlns:cx="http://schemas.microsoft.com/office/drawing/2014/chartex" xmlns:cx1="http://schemas.microsoft.com/office/drawing/2015/9/8/chartex" xmlns:cx2="http://schemas.microsoft.com/office/drawing/2015/10/21/chartex" xmlns:cx3="http://schemas.microsoft.com/office/drawing/2016/5/9/chartex" xmlns:cx4="http://schemas.microsoft.com/office/drawing/2016/5/10/chartex" xmlns:cx5="http://schemas.microsoft.com/office/drawing/2016/5/11/chartex" xmlns:cx6="http://schemas.microsoft.com/office/drawing/2016/5/12/chartex" xmlns:cx7="http://schemas.microsoft.com/office/drawing/2016/5/13/chartex" xmlns:cx8="http://schemas.microsoft.com/office/drawing/2016/5/14/chartex" xmlns:mc="http://schemas.openxmlformats.org/markup-compatibility/2006" xmlns:aink="http://schemas.microsoft.com/office/drawing/2016/ink" xmlns:am3d="http://schemas.microsoft.com/office/drawing/2017/model3d" xmlns:o="urn:schemas-microsoft-com:office:office" xmlns:oel="http://schemas.microsoft.com/office/2019/extlst" xmlns:r="http://schemas.openxmlformats.org/officeDocument/2006/relationships" xmlns:m="http://schemas.openxmlformats.org/officeDocument/2006/math" xmlns:v="urn:schemas-microsoft-com:vml" xmlns:wp14="http://schemas.microsoft.com/office/word/2010/wordprocessingDrawing" xmlns:wp="http://schemas.openxmlformats.org/drawingml/2006/wordprocessingDrawing" xmlns:w10="urn:schemas-microsoft-com:office:word" xmlns:w="http://schemas.openxmlformats.org/wordprocessingml/2006/main" xmlns:w14="http://schemas.microsoft.com/office/word/2010/wordml" xmlns:w15="http://schemas.microsoft.com/office/word/2012/wordml" xmlns:w16cei="http://schemas.microsoft.com/office/word/2026/wordml/cei" xmlns:w16cex="http://schemas.microsoft.com/office/word/2018/wordml/cex" xmlns:w16cid="http://schemas.microsoft.com/office/word/2016/wordml/cid" xmlns:w16="http://schemas.microsoft.com/office/word/2018/wordml" xmlns:w16du="http://schemas.microsoft.com/office/word/2023/wordml/word16du" xmlns:w16sdtdh="http://schemas.microsoft.com/office/word/2020/wordml/sdtdatahash" xmlns:w16sdtfl="http://schemas.microsoft.com/office/word/2024/wordml/sdtformatlock" xmlns:w16se="http://schemas.microsoft.com/office/word/2015/wordml/symex" xmlns:wpg="http://schemas.microsoft.com/office/word/2010/wordprocessingGroup" xmlns:wpi="http://schemas.microsoft.com/office/word/2010/wordprocessingInk" xmlns:wne="http://schemas.microsoft.com/office/word/2006/wordml" xmlns:wps="http://schemas.microsoft.com/office/word/2010/wordprocessingShape" mc:Ignorable="w14 w15 w16se w16cid w16 w16cex w16sdtdh w16sdtfl w16du wp14">
+  <w:abstractNum w:abstractNumId="0" w15:restartNumberingAfterBreak="0">
+    <w:nsid w:val="21E44DE6"/>
+    <w:multiLevelType w:val="hybridMultilevel"/>
+    <w:tmpl w:val="E696A9EE"/>
+    <w:lvl w:ilvl="0" w:tplc="ADC26FBC">
+      <w:numFmt w:val="bullet"/>
+      <w:lvlText w:val="-"/>
+      <w:lvlJc w:val="left"/>
+      <w:pPr>
+        <w:ind w:left="720" w:hanging="360"/>
+      </w:pPr>
+      <w:rPr>
+        <w:rFonts w:ascii="Times New Roman" w:eastAsia="Times" w:hAnsi="Times New Roman" w:cs="Times New Roman" w:hint="default"/>
+      </w:rPr>
+    </w:lvl>
+    <w:lvl w:ilvl="1" w:tplc="04090003">
+      <w:start w:val="1"/>
+      <w:numFmt w:val="bullet"/>
+      <w:lvlText w:val="o"/>
+      <w:lvlJc w:val="left"/>
+      <w:pPr>
+        <w:ind w:left="1440" w:hanging="360"/>
+      </w:pPr>
+      <w:rPr>
+        <w:rFonts w:ascii="Courier New" w:hAnsi="Courier New" w:cs="Courier New" w:hint="default"/>
+      </w:rPr>
+    </w:lvl>
+    <w:lvl w:ilvl="2" w:tplc="04090005">
+      <w:start w:val="1"/>
+      <w:numFmt w:val="bullet"/>
+      <w:lvlText w:val=""/>
+      <w:lvlJc w:val="left"/>
+      <w:pPr>
+        <w:ind w:left="2160" w:hanging="360"/>
+      </w:pPr>
+      <w:rPr>
+        <w:rFonts w:ascii="Wingdings" w:hAnsi="Wingdings" w:hint="default"/>
+      </w:rPr>
+    </w:lvl>
+    <w:lvl w:ilvl="3" w:tplc="04090001" w:tentative="1">
+      <w:start w:val="1"/>
+      <w:numFmt w:val="bullet"/>
+      <w:lvlText w:val=""/>
+      <w:lvlJc w:val="left"/>
+      <w:pPr>
+        <w:ind w:left="2880" w:hanging="360"/>
+      </w:pPr>
+      <w:rPr>
+        <w:rFonts w:ascii="Symbol" w:hAnsi="Symbol" w:hint="default"/>
+      </w:rPr>
+    </w:lvl>
+    <w:lvl w:ilvl="4" w:tplc="04090003" w:tentative="1">
+      <w:start w:val="1"/>
+      <w:numFmt w:val="bullet"/>
+      <w:lvlText w:val="o"/>
+      <w:lvlJc w:val="left"/>
+      <w:pPr>
+        <w:ind w:left="3600" w:hanging="360"/>
+      </w:pPr>
+      <w:rPr>
+        <w:rFonts w:ascii="Courier New" w:hAnsi="Courier New" w:cs="Courier New" w:hint="default"/>
+      </w:rPr>
+    </w:lvl>
+    <w:lvl w:ilvl="5" w:tplc="04090005" w:tentative="1">
+      <w:start w:val="1"/>
+      <w:numFmt w:val="bullet"/>
+      <w:lvlText w:val=""/>
+      <w:lvlJc w:val="left"/>
+      <w:pPr>
+        <w:ind w:left="4320" w:hanging="360"/>
+      </w:pPr>
+      <w:rPr>
+        <w:rFonts w:ascii="Wingdings" w:hAnsi="Wingdings" w:hint="default"/>
+      </w:rPr>
+    </w:lvl>
+    <w:lvl w:ilvl="6" w:tplc="04090001" w:tentative="1">
+      <w:start w:val="1"/>
+      <w:numFmt w:val="bullet"/>
+      <w:lvlText w:val=""/>
+      <w:lvlJc w:val="left"/>
+      <w:pPr>
+        <w:ind w:left="5040" w:hanging="360"/>
+      </w:pPr>
+      <w:rPr>
+        <w:rFonts w:ascii="Symbol" w:hAnsi="Symbol" w:hint="default"/>
+      </w:rPr>
+    </w:lvl>
+    <w:lvl w:ilvl="7" w:tplc="04090003" w:tentative="1">
+      <w:start w:val="1"/>
+      <w:numFmt w:val="bullet"/>
+      <w:lvlText w:val="o"/>
+      <w:lvlJc w:val="left"/>
+      <w:pPr>
+        <w:ind w:left="5760" w:hanging="360"/>
+      </w:pPr>
+      <w:rPr>
+        <w:rFonts w:ascii="Courier New" w:hAnsi="Courier New" w:cs="Courier New" w:hint="default"/>
+      </w:rPr>
+    </w:lvl>
+    <w:lvl w:ilvl="8" w:tplc="04090005" w:tentative="1">
+      <w:start w:val="1"/>
+      <w:numFmt w:val="bullet"/>
+      <w:lvlText w:val=""/>
+      <w:lvlJc w:val="left"/>
+      <w:pPr>
+        <w:ind w:left="6480" w:hanging="360"/>
+      </w:pPr>
+      <w:rPr>
+        <w:rFonts w:ascii="Wingdings" w:hAnsi="Wingdings" w:hint="default"/>
+      </w:rPr>
+    </w:lvl>
+  </w:abstractNum>
+  <w:num w:numId="1" w16cid:durableId="1238783370">
+    <w:abstractNumId w:val="0"/>
+  </w:num>
+</w:numbering>
 </file>
 
 <file path=word/styles.xml><?xml version="1.0" encoding="utf-8"?>
@@ -1499,6 +1605,17 @@
       <w:sz w:val="24"/>
     </w:rPr>
   </w:style>
+  <w:style w:type="paragraph" w:styleId="ListParagraph">
+    <w:name w:val="List Paragraph"/>
+    <w:basedOn w:val="Normal"/>
+    <w:uiPriority w:val="72"/>
+    <w:qFormat/>
+    <w:rsid w:val="005529D5"/>
+    <w:pPr>
+      <w:ind w:left="720"/>
+      <w:contextualSpacing/>
+    </w:pPr>
+  </w:style>
 </w:styles>
 </file>
 

</xml_diff>